<commit_message>
State machine kinda works now
</commit_message>
<xml_diff>
--- a/GEP 25-26 Worksheet 1.docx
+++ b/GEP 25-26 Worksheet 1.docx
@@ -373,7 +373,7 @@
         <w:sdtPr>
           <w:id w:val="1740439158"/>
           <w14:checkbox>
-            <w14:checked w14:val="0"/>
+            <w14:checked w14:val="1"/>
             <w14:checkedState w14:val="2612" w14:font="MS Gothic"/>
             <w14:uncheckedState w14:val="2610" w14:font="MS Gothic"/>
           </w14:checkbox>
@@ -383,7 +383,7 @@
             <w:rPr>
               <w:rFonts w:ascii="MS Gothic" w:eastAsia="MS Gothic" w:hAnsi="MS Gothic" w:hint="eastAsia"/>
             </w:rPr>
-            <w:t>☐</w:t>
+            <w:t>☒</w:t>
           </w:r>
         </w:sdtContent>
       </w:sdt>
@@ -397,7 +397,7 @@
         <w:sdtPr>
           <w:id w:val="1506394597"/>
           <w14:checkbox>
-            <w14:checked w14:val="0"/>
+            <w14:checked w14:val="1"/>
             <w14:checkedState w14:val="2612" w14:font="MS Gothic"/>
             <w14:uncheckedState w14:val="2610" w14:font="MS Gothic"/>
           </w14:checkbox>
@@ -407,7 +407,7 @@
             <w:rPr>
               <w:rFonts w:ascii="MS Gothic" w:eastAsia="MS Gothic" w:hAnsi="MS Gothic" w:hint="eastAsia"/>
             </w:rPr>
-            <w:t>☐</w:t>
+            <w:t>☒</w:t>
           </w:r>
         </w:sdtContent>
       </w:sdt>
@@ -9544,6 +9544,17 @@
 </file>
 
 <file path=customXml/item1.xml><?xml version="1.0" encoding="utf-8"?>
+<p:properties xmlns:p="http://schemas.microsoft.com/office/2006/metadata/properties" xmlns:xsi="http://www.w3.org/2001/XMLSchema-instance" xmlns:pc="http://schemas.microsoft.com/office/infopath/2007/PartnerControls">
+  <documentManagement>
+    <TaxCatchAll xmlns="9d0996c0-92aa-48de-be34-d82d85a58d42" xsi:nil="true"/>
+    <lcf76f155ced4ddcb4097134ff3c332f xmlns="3ad65f39-9fa6-40f7-afab-38d2a8f659f9">
+      <Terms xmlns="http://schemas.microsoft.com/office/infopath/2007/PartnerControls"/>
+    </lcf76f155ced4ddcb4097134ff3c332f>
+  </documentManagement>
+</p:properties>
+</file>
+
+<file path=customXml/item2.xml><?xml version="1.0" encoding="utf-8"?>
 <ct:contentTypeSchema xmlns:ct="http://schemas.microsoft.com/office/2006/metadata/contentType" xmlns:ma="http://schemas.microsoft.com/office/2006/metadata/properties/metaAttributes" ct:_="" ma:_="" ma:contentTypeName="Document" ma:contentTypeID="0x0101001BECA5111B9F15418DB6E90C815CB950" ma:contentTypeVersion="19" ma:contentTypeDescription="Create a new document." ma:contentTypeScope="" ma:versionID="cb96dcb735f67fe489b9d6a491775850">
   <xsd:schema xmlns:xsd="http://www.w3.org/2001/XMLSchema" xmlns:xs="http://www.w3.org/2001/XMLSchema" xmlns:p="http://schemas.microsoft.com/office/2006/metadata/properties" xmlns:ns2="9d0996c0-92aa-48de-be34-d82d85a58d42" xmlns:ns3="3ad65f39-9fa6-40f7-afab-38d2a8f659f9" targetNamespace="http://schemas.microsoft.com/office/2006/metadata/properties" ma:root="true" ma:fieldsID="ce5eca6df8a9b9f3e548e771f2e2bae3" ns2:_="" ns3:_="">
     <xsd:import namespace="9d0996c0-92aa-48de-be34-d82d85a58d42"/>
@@ -9804,17 +9815,6 @@
 </ct:contentTypeSchema>
 </file>
 
-<file path=customXml/item2.xml><?xml version="1.0" encoding="utf-8"?>
-<p:properties xmlns:p="http://schemas.microsoft.com/office/2006/metadata/properties" xmlns:xsi="http://www.w3.org/2001/XMLSchema-instance" xmlns:pc="http://schemas.microsoft.com/office/infopath/2007/PartnerControls">
-  <documentManagement>
-    <TaxCatchAll xmlns="9d0996c0-92aa-48de-be34-d82d85a58d42" xsi:nil="true"/>
-    <lcf76f155ced4ddcb4097134ff3c332f xmlns="3ad65f39-9fa6-40f7-afab-38d2a8f659f9">
-      <Terms xmlns="http://schemas.microsoft.com/office/infopath/2007/PartnerControls"/>
-    </lcf76f155ced4ddcb4097134ff3c332f>
-  </documentManagement>
-</p:properties>
-</file>
-
 <file path=customXml/item3.xml><?xml version="1.0" encoding="utf-8"?>
 <?mso-contentType ?>
 <FormTemplates xmlns="http://schemas.microsoft.com/sharepoint/v3/contenttype/forms">
@@ -9825,6 +9825,17 @@
 </file>
 
 <file path=customXml/itemProps1.xml><?xml version="1.0" encoding="utf-8"?>
+<ds:datastoreItem xmlns:ds="http://schemas.openxmlformats.org/officeDocument/2006/customXml" ds:itemID="{732812F3-F22F-40A6-B47F-2A4BCB919407}">
+  <ds:schemaRefs>
+    <ds:schemaRef ds:uri="http://schemas.microsoft.com/office/2006/metadata/properties"/>
+    <ds:schemaRef ds:uri="http://schemas.microsoft.com/office/infopath/2007/PartnerControls"/>
+    <ds:schemaRef ds:uri="9d0996c0-92aa-48de-be34-d82d85a58d42"/>
+    <ds:schemaRef ds:uri="3ad65f39-9fa6-40f7-afab-38d2a8f659f9"/>
+  </ds:schemaRefs>
+</ds:datastoreItem>
+</file>
+
+<file path=customXml/itemProps2.xml><?xml version="1.0" encoding="utf-8"?>
 <ds:datastoreItem xmlns:ds="http://schemas.openxmlformats.org/officeDocument/2006/customXml" ds:itemID="{B6BAFB03-C161-41D2-8692-D31C049EAC1C}">
   <ds:schemaRefs>
     <ds:schemaRef ds:uri="http://schemas.microsoft.com/office/2006/metadata/contentType"/>
@@ -9843,17 +9854,6 @@
 </ds:datastoreItem>
 </file>
 
-<file path=customXml/itemProps2.xml><?xml version="1.0" encoding="utf-8"?>
-<ds:datastoreItem xmlns:ds="http://schemas.openxmlformats.org/officeDocument/2006/customXml" ds:itemID="{732812F3-F22F-40A6-B47F-2A4BCB919407}">
-  <ds:schemaRefs>
-    <ds:schemaRef ds:uri="http://schemas.microsoft.com/office/2006/metadata/properties"/>
-    <ds:schemaRef ds:uri="http://schemas.microsoft.com/office/infopath/2007/PartnerControls"/>
-    <ds:schemaRef ds:uri="9d0996c0-92aa-48de-be34-d82d85a58d42"/>
-    <ds:schemaRef ds:uri="3ad65f39-9fa6-40f7-afab-38d2a8f659f9"/>
-  </ds:schemaRefs>
-</ds:datastoreItem>
-</file>
-
 <file path=customXml/itemProps3.xml><?xml version="1.0" encoding="utf-8"?>
 <ds:datastoreItem xmlns:ds="http://schemas.openxmlformats.org/officeDocument/2006/customXml" ds:itemID="{9CCE7874-640B-43E8-943D-5071FCF6A23C}">
   <ds:schemaRefs>

</xml_diff>